<commit_message>
Added code output, updated research
</commit_message>
<xml_diff>
--- a/6-13 Summer Project.docx
+++ b/6-13 Summer Project.docx
@@ -146,22 +146,33 @@
           <w:b/>
           <w:bCs/>
         </w:rPr>
-        <w:t xml:space="preserve"> 2015? Are there any changes between the two years?</w:t>
-      </w:r>
-    </w:p>
-    <w:p>
-      <w:pPr>
-        <w:rPr>
-          <w:b/>
-          <w:bCs/>
-        </w:rPr>
-      </w:pPr>
-      <w:r>
-        <w:rPr>
-          <w:b/>
-          <w:bCs/>
-        </w:rPr>
-        <w:t>- Do the distributions of GDP in 2010 vs. 2015 have equal variance?</w:t>
+        <w:t xml:space="preserve"> 2015? </w:t>
+      </w:r>
+    </w:p>
+    <w:p>
+      <w:pPr>
+        <w:rPr>
+          <w:b/>
+          <w:bCs/>
+          <w:i/>
+          <w:iCs/>
+        </w:rPr>
+      </w:pPr>
+      <w:r>
+        <w:rPr>
+          <w:b/>
+          <w:bCs/>
+          <w:i/>
+          <w:iCs/>
+        </w:rPr>
+        <w:t xml:space="preserve">- </w:t>
+      </w:r>
+      <w:r>
+        <w:rPr>
+          <w:b/>
+          <w:bCs/>
+        </w:rPr>
+        <w:t>Do the distributions of GDP in 2010 vs. 2015 have equal variance?</w:t>
       </w:r>
     </w:p>
     <w:p>
@@ -190,60 +201,32 @@
         <w:rPr>
           <w:b/>
           <w:bCs/>
-        </w:rPr>
-        <w:t xml:space="preserve">- Does the GDP differ between country A to country B </w:t>
-      </w:r>
-      <w:r>
-        <w:rPr>
-          <w:b/>
-          <w:bCs/>
-        </w:rPr>
-        <w:t xml:space="preserve">in 2015 </w:t>
-      </w:r>
-      <w:r>
-        <w:rPr>
-          <w:b/>
-          <w:bCs/>
-        </w:rPr>
-        <w:t>by a statistically significant amount?</w:t>
-      </w:r>
-      <w:r>
-        <w:rPr>
-          <w:b/>
-          <w:bCs/>
-        </w:rPr>
-        <w:t xml:space="preserve"> In 2010?</w:t>
-      </w:r>
-    </w:p>
-    <w:p>
-      <w:pPr>
-        <w:rPr>
-          <w:b/>
-          <w:bCs/>
-        </w:rPr>
-      </w:pPr>
-      <w:r>
-        <w:rPr>
-          <w:b/>
-          <w:bCs/>
-        </w:rPr>
-        <w:t xml:space="preserve">- Does the GDP differ among regions A, B, and C by a statistically significant amount </w:t>
-      </w:r>
-      <w:proofErr w:type="spellStart"/>
-      <w:r>
-        <w:rPr>
-          <w:b/>
-          <w:bCs/>
-        </w:rPr>
-        <w:t>over all</w:t>
-      </w:r>
-      <w:proofErr w:type="spellEnd"/>
-      <w:r>
-        <w:rPr>
-          <w:b/>
-          <w:bCs/>
-        </w:rPr>
-        <w:t xml:space="preserve"> years?</w:t>
+          <w:i/>
+          <w:iCs/>
+        </w:rPr>
+        <w:t xml:space="preserve">- </w:t>
+      </w:r>
+      <w:r>
+        <w:rPr>
+          <w:b/>
+          <w:bCs/>
+        </w:rPr>
+        <w:t>Does the GDP differ between country A to country B by a statistically significant amount?</w:t>
+      </w:r>
+    </w:p>
+    <w:p>
+      <w:pPr>
+        <w:rPr>
+          <w:b/>
+          <w:bCs/>
+        </w:rPr>
+      </w:pPr>
+      <w:r>
+        <w:rPr>
+          <w:b/>
+          <w:bCs/>
+        </w:rPr>
+        <w:t>- Does the GDP differ among regions A, B, and C by a statistically significant amount over all years?</w:t>
       </w:r>
     </w:p>
     <w:p>
@@ -304,14 +287,7 @@
         <w:t>?</w:t>
       </w:r>
     </w:p>
-    <w:p>
-      <w:pPr>
-        <w:rPr>
-          <w:b/>
-          <w:bCs/>
-        </w:rPr>
-      </w:pPr>
-    </w:p>
+    <w:p/>
     <w:p>
       <w:r>
         <w:t>Broader Questions:</w:t>
@@ -329,22 +305,22 @@
           <w:b/>
           <w:bCs/>
         </w:rPr>
+        <w:t xml:space="preserve">- Predict a country’s GDP 5 years into the future. </w:t>
+      </w:r>
+    </w:p>
+    <w:p>
+      <w:pPr>
+        <w:rPr>
+          <w:b/>
+          <w:bCs/>
+        </w:rPr>
+      </w:pPr>
+      <w:r>
+        <w:rPr>
+          <w:b/>
+          <w:bCs/>
+        </w:rPr>
         <w:lastRenderedPageBreak/>
-        <w:t xml:space="preserve">- Predict a country’s GDP 5 years into the future. </w:t>
-      </w:r>
-    </w:p>
-    <w:p>
-      <w:pPr>
-        <w:rPr>
-          <w:b/>
-          <w:bCs/>
-        </w:rPr>
-      </w:pPr>
-      <w:r>
-        <w:rPr>
-          <w:b/>
-          <w:bCs/>
-        </w:rPr>
         <w:t>- Suppose we were to cluster these countries. What variables would define each cluster</w:t>
       </w:r>
       <w:r>
@@ -401,6 +377,12 @@
       </w:r>
     </w:p>
     <w:p>
+      <w:pPr>
+        <w:rPr>
+          <w:b/>
+          <w:bCs/>
+        </w:rPr>
+      </w:pPr>
       <w:r>
         <w:rPr>
           <w:b/>
@@ -409,6 +391,295 @@
         <w:t>- Suppose we modify the variables of country A. How would its expected GDP change? How about its expected GDP 5 years into the future?</w:t>
       </w:r>
     </w:p>
+    <w:p>
+      <w:pPr>
+        <w:rPr>
+          <w:b/>
+          <w:bCs/>
+        </w:rPr>
+      </w:pPr>
+    </w:p>
+    <w:p>
+      <w:r>
+        <w:t>Julius:</w:t>
+      </w:r>
+    </w:p>
+    <w:p>
+      <w:pPr>
+        <w:pStyle w:val="ListParagraph"/>
+        <w:numPr>
+          <w:ilvl w:val="0"/>
+          <w:numId w:val="2"/>
+        </w:numPr>
+      </w:pPr>
+      <w:r>
+        <w:t>Uses</w:t>
+      </w:r>
+      <w:r>
+        <w:t xml:space="preserve"> Shapiro-Wilk, which generalizes pretty well to larger number of data points</w:t>
+      </w:r>
+    </w:p>
+    <w:p>
+      <w:pPr>
+        <w:pStyle w:val="ListParagraph"/>
+        <w:numPr>
+          <w:ilvl w:val="0"/>
+          <w:numId w:val="2"/>
+        </w:numPr>
+      </w:pPr>
+      <w:r>
+        <w:t>Uses parametric tests rather than non-parametric tests; however, GDP does not follow a normal distribution as per our analysis. Tests seem to generalize pretty well but it would be interesting to see cases where a non-parametric test is needed and results might differ</w:t>
+      </w:r>
+    </w:p>
+    <w:p>
+      <w:pPr>
+        <w:pStyle w:val="ListParagraph"/>
+        <w:numPr>
+          <w:ilvl w:val="0"/>
+          <w:numId w:val="2"/>
+        </w:numPr>
+      </w:pPr>
+      <w:r>
+        <w:t>Follow-up questions are interesting and useful</w:t>
+      </w:r>
+      <w:r>
+        <w:t xml:space="preserve"> – used Tukey’s HSD as a follow-up to ANOVA, which I did not know about and have incorporated into my code</w:t>
+      </w:r>
+    </w:p>
+    <w:p>
+      <w:pPr>
+        <w:pStyle w:val="ListParagraph"/>
+        <w:numPr>
+          <w:ilvl w:val="0"/>
+          <w:numId w:val="2"/>
+        </w:numPr>
+      </w:pPr>
+      <w:r>
+        <w:t>Multivariable linear regression does not seem to produce accurate results – Julius prints out all variables but only 2 actually have statistically significant p-values and are significant predictors</w:t>
+      </w:r>
+    </w:p>
+    <w:p>
+      <w:pPr>
+        <w:pStyle w:val="ListParagraph"/>
+        <w:numPr>
+          <w:ilvl w:val="0"/>
+          <w:numId w:val="2"/>
+        </w:numPr>
+      </w:pPr>
+      <w:r>
+        <w:t xml:space="preserve">I would consider GDP calculations for the same country over two years as a paired sample (as the country remains the same) but Julius uses an unpaired t-test </w:t>
+      </w:r>
+    </w:p>
+    <w:p>
+      <w:r>
+        <w:t>ChatGPT:</w:t>
+      </w:r>
+    </w:p>
+    <w:p>
+      <w:pPr>
+        <w:pStyle w:val="ListParagraph"/>
+        <w:numPr>
+          <w:ilvl w:val="0"/>
+          <w:numId w:val="2"/>
+        </w:numPr>
+      </w:pPr>
+      <w:r>
+        <w:t>Uses Shapiro-Wilk, same result as Julius</w:t>
+      </w:r>
+    </w:p>
+    <w:p>
+      <w:pPr>
+        <w:pStyle w:val="ListParagraph"/>
+        <w:numPr>
+          <w:ilvl w:val="0"/>
+          <w:numId w:val="2"/>
+        </w:numPr>
+      </w:pPr>
+      <w:r>
+        <w:rPr>
+          <w:i/>
+          <w:iCs/>
+        </w:rPr>
+        <w:t xml:space="preserve">Ran out of GPT 4 usage so waiting to run </w:t>
+      </w:r>
+      <w:r>
+        <w:rPr>
+          <w:i/>
+          <w:iCs/>
+        </w:rPr>
+        <w:t>this at 6 PM</w:t>
+      </w:r>
+    </w:p>
+    <w:p>
+      <w:r>
+        <w:t>Copilot:</w:t>
+      </w:r>
+    </w:p>
+    <w:p>
+      <w:r>
+        <w:t>Databricks:</w:t>
+      </w:r>
+    </w:p>
+    <w:p/>
+    <w:p>
+      <w:r>
+        <w:t>Tests to determine normality:</w:t>
+      </w:r>
+      <w:r>
+        <w:t xml:space="preserve"> </w:t>
+      </w:r>
+      <w:r>
+        <w:t>https://www.youtube.com/watch?v=uI0bXSCG-NA</w:t>
+      </w:r>
+    </w:p>
+    <w:p>
+      <w:pPr>
+        <w:pStyle w:val="ListParagraph"/>
+        <w:numPr>
+          <w:ilvl w:val="0"/>
+          <w:numId w:val="2"/>
+        </w:numPr>
+      </w:pPr>
+      <w:r>
+        <w:t>Check skewness (absolute value of .8 indicates non-normality), kurtosis (absolute value of 3 indicates non-normality)</w:t>
+      </w:r>
+    </w:p>
+    <w:p>
+      <w:pPr>
+        <w:pStyle w:val="ListParagraph"/>
+        <w:numPr>
+          <w:ilvl w:val="0"/>
+          <w:numId w:val="2"/>
+        </w:numPr>
+      </w:pPr>
+      <w:r>
+        <w:t>Shapiro-Wilk generally preferred as it has greater statistical power</w:t>
+      </w:r>
+    </w:p>
+    <w:p>
+      <w:pPr>
+        <w:pStyle w:val="ListParagraph"/>
+        <w:numPr>
+          <w:ilvl w:val="0"/>
+          <w:numId w:val="2"/>
+        </w:numPr>
+      </w:pPr>
+      <w:r>
+        <w:t>However tests need to be complemented with graphical methods such as histograms and QQ plots to determine normality for certain</w:t>
+      </w:r>
+    </w:p>
+    <w:p>
+      <w:pPr>
+        <w:pStyle w:val="ListParagraph"/>
+        <w:numPr>
+          <w:ilvl w:val="0"/>
+          <w:numId w:val="2"/>
+        </w:numPr>
+      </w:pPr>
+      <w:r>
+        <w:t>One solution might be to run both Shapiro-Wilk and K-S and then output QQ plots for data where there seems to be a discrepancy so the user can check visually</w:t>
+      </w:r>
+    </w:p>
+    <w:p>
+      <w:pPr>
+        <w:pStyle w:val="ListParagraph"/>
+        <w:numPr>
+          <w:ilvl w:val="1"/>
+          <w:numId w:val="2"/>
+        </w:numPr>
+      </w:pPr>
+      <w:r>
+        <w:t>K-S is typically used for larger sample sizes but Shapiro-Wilk has more statistical power for smaller data sets</w:t>
+      </w:r>
+    </w:p>
+    <w:p>
+      <w:pPr>
+        <w:pStyle w:val="ListParagraph"/>
+        <w:numPr>
+          <w:ilvl w:val="1"/>
+          <w:numId w:val="2"/>
+        </w:numPr>
+      </w:pPr>
+      <w:r>
+        <w:t>Honestly lots of different approaches – some people say only use Shapiro-Wilk, some people say use K-S for larger sample sizes, some say rely more on visual data</w:t>
+      </w:r>
+    </w:p>
+    <w:p>
+      <w:pPr>
+        <w:pStyle w:val="ListParagraph"/>
+        <w:numPr>
+          <w:ilvl w:val="1"/>
+          <w:numId w:val="2"/>
+        </w:numPr>
+      </w:pPr>
+      <w:r>
+        <w:lastRenderedPageBreak/>
+        <w:t xml:space="preserve">With larger data sets, CLT will allow us to generally assume a normal distribution </w:t>
+      </w:r>
+    </w:p>
+    <w:p>
+      <w:r>
+        <w:t xml:space="preserve">Example – K-S says this is normal but S-W says it’s not. I would say it’s not normal based on the QQ plot    </w:t>
+      </w:r>
+      <w:r>
+        <w:drawing>
+          <wp:inline distT="0" distB="0" distL="0" distR="0" wp14:anchorId="5A804FAF" wp14:editId="525527C2">
+            <wp:extent cx="1863643" cy="1333742"/>
+            <wp:effectExtent l="0" t="0" r="3810" b="0"/>
+            <wp:docPr id="570369099" name="Picture 1" descr="A graph with a red line and blue dots&#10;&#10;Description automatically generated"/>
+            <wp:cNvGraphicFramePr>
+              <a:graphicFrameLocks xmlns:a="http://schemas.openxmlformats.org/drawingml/2006/main" noChangeAspect="1"/>
+            </wp:cNvGraphicFramePr>
+            <a:graphic xmlns:a="http://schemas.openxmlformats.org/drawingml/2006/main">
+              <a:graphicData uri="http://schemas.openxmlformats.org/drawingml/2006/picture">
+                <pic:pic xmlns:pic="http://schemas.openxmlformats.org/drawingml/2006/picture">
+                  <pic:nvPicPr>
+                    <pic:cNvPr id="570369099" name="Picture 1" descr="A graph with a red line and blue dots&#10;&#10;Description automatically generated"/>
+                    <pic:cNvPicPr/>
+                  </pic:nvPicPr>
+                  <pic:blipFill>
+                    <a:blip r:embed="rId6"/>
+                    <a:stretch>
+                      <a:fillRect/>
+                    </a:stretch>
+                  </pic:blipFill>
+                  <pic:spPr>
+                    <a:xfrm>
+                      <a:off x="0" y="0"/>
+                      <a:ext cx="1877372" cy="1343567"/>
+                    </a:xfrm>
+                    <a:prstGeom prst="rect">
+                      <a:avLst/>
+                    </a:prstGeom>
+                  </pic:spPr>
+                </pic:pic>
+              </a:graphicData>
+            </a:graphic>
+          </wp:inline>
+        </w:drawing>
+      </w:r>
+    </w:p>
+    <w:p>
+      <w:pPr>
+        <w:pStyle w:val="ListParagraph"/>
+        <w:numPr>
+          <w:ilvl w:val="0"/>
+          <w:numId w:val="2"/>
+        </w:numPr>
+        <w:rPr>
+          <w:i/>
+          <w:iCs/>
+        </w:rPr>
+      </w:pPr>
+      <w:r>
+        <w:rPr>
+          <w:i/>
+          <w:iCs/>
+        </w:rPr>
+        <w:t>To do: go through the data and plot discrepancies between the two, determine whether one might be better than the other since the literature is unclear</w:t>
+      </w:r>
+    </w:p>
+    <w:p/>
     <w:sectPr>
       <w:pgSz w:w="12240" w:h="15840"/>
       <w:pgMar w:top="1440" w:right="1440" w:bottom="1440" w:left="1440" w:header="720" w:footer="720" w:gutter="0"/>
@@ -422,6 +693,118 @@
 <file path=word/numbering.xml><?xml version="1.0" encoding="utf-8"?>
 <w:numbering xmlns:wpc="http://schemas.microsoft.com/office/word/2010/wordprocessingCanvas" xmlns:cx="http://schemas.microsoft.com/office/drawing/2014/chartex" xmlns:cx1="http://schemas.microsoft.com/office/drawing/2015/9/8/chartex" xmlns:cx2="http://schemas.microsoft.com/office/drawing/2015/10/21/chartex" xmlns:cx3="http://schemas.microsoft.com/office/drawing/2016/5/9/chartex" xmlns:cx4="http://schemas.microsoft.com/office/drawing/2016/5/10/chartex" xmlns:cx5="http://schemas.microsoft.com/office/drawing/2016/5/11/chartex" xmlns:cx6="http://schemas.microsoft.com/office/drawing/2016/5/12/chartex" xmlns:cx7="http://schemas.microsoft.com/office/drawing/2016/5/13/chartex" xmlns:cx8="http://schemas.microsoft.com/office/drawing/2016/5/14/chartex" xmlns:mc="http://schemas.openxmlformats.org/markup-compatibility/2006" xmlns:aink="http://schemas.microsoft.com/office/drawing/2016/ink" xmlns:am3d="http://schemas.microsoft.com/office/drawing/2017/model3d" xmlns:o="urn:schemas-microsoft-com:office:office" xmlns:oel="http://schemas.microsoft.com/office/2019/extlst" xmlns:r="http://schemas.openxmlformats.org/officeDocument/2006/relationships" xmlns:m="http://schemas.openxmlformats.org/officeDocument/2006/math" xmlns:v="urn:schemas-microsoft-com:vml" xmlns:wp14="http://schemas.microsoft.com/office/word/2010/wordprocessingDrawing" xmlns:wp="http://schemas.openxmlformats.org/drawingml/2006/wordprocessingDrawing" xmlns:w10="urn:schemas-microsoft-com:office:word" xmlns:w="http://schemas.openxmlformats.org/wordprocessingml/2006/main" xmlns:w14="http://schemas.microsoft.com/office/word/2010/wordml" xmlns:w15="http://schemas.microsoft.com/office/word/2012/wordml" xmlns:w16cex="http://schemas.microsoft.com/office/word/2018/wordml/cex" xmlns:w16cid="http://schemas.microsoft.com/office/word/2016/wordml/cid" xmlns:w16="http://schemas.microsoft.com/office/word/2018/wordml" xmlns:w16du="http://schemas.microsoft.com/office/word/2023/wordml/word16du" xmlns:w16sdtdh="http://schemas.microsoft.com/office/word/2020/wordml/sdtdatahash" xmlns:w16se="http://schemas.microsoft.com/office/word/2015/wordml/symex" xmlns:wpg="http://schemas.microsoft.com/office/word/2010/wordprocessingGroup" xmlns:wpi="http://schemas.microsoft.com/office/word/2010/wordprocessingInk" xmlns:wne="http://schemas.microsoft.com/office/word/2006/wordml" xmlns:wps="http://schemas.microsoft.com/office/word/2010/wordprocessingShape" mc:Ignorable="w14 w15 w16se w16cid w16 w16cex w16sdtdh w16du wp14">
   <w:abstractNum w:abstractNumId="0" w15:restartNumberingAfterBreak="0">
+    <w:nsid w:val="34D6285B"/>
+    <w:multiLevelType w:val="hybridMultilevel"/>
+    <w:tmpl w:val="237EDCF0"/>
+    <w:lvl w:ilvl="0" w:tplc="CA84DE28">
+      <w:numFmt w:val="bullet"/>
+      <w:lvlText w:val="-"/>
+      <w:lvlJc w:val="left"/>
+      <w:pPr>
+        <w:ind w:left="720" w:hanging="360"/>
+      </w:pPr>
+      <w:rPr>
+        <w:rFonts w:ascii="Aptos" w:eastAsiaTheme="minorHAnsi" w:hAnsi="Aptos" w:cstheme="minorBidi" w:hint="default"/>
+      </w:rPr>
+    </w:lvl>
+    <w:lvl w:ilvl="1" w:tplc="04090003">
+      <w:start w:val="1"/>
+      <w:numFmt w:val="bullet"/>
+      <w:lvlText w:val="o"/>
+      <w:lvlJc w:val="left"/>
+      <w:pPr>
+        <w:ind w:left="1440" w:hanging="360"/>
+      </w:pPr>
+      <w:rPr>
+        <w:rFonts w:ascii="Courier New" w:hAnsi="Courier New" w:cs="Courier New" w:hint="default"/>
+      </w:rPr>
+    </w:lvl>
+    <w:lvl w:ilvl="2" w:tplc="04090005" w:tentative="1">
+      <w:start w:val="1"/>
+      <w:numFmt w:val="bullet"/>
+      <w:lvlText w:val=""/>
+      <w:lvlJc w:val="left"/>
+      <w:pPr>
+        <w:ind w:left="2160" w:hanging="360"/>
+      </w:pPr>
+      <w:rPr>
+        <w:rFonts w:ascii="Wingdings" w:hAnsi="Wingdings" w:hint="default"/>
+      </w:rPr>
+    </w:lvl>
+    <w:lvl w:ilvl="3" w:tplc="04090001" w:tentative="1">
+      <w:start w:val="1"/>
+      <w:numFmt w:val="bullet"/>
+      <w:lvlText w:val=""/>
+      <w:lvlJc w:val="left"/>
+      <w:pPr>
+        <w:ind w:left="2880" w:hanging="360"/>
+      </w:pPr>
+      <w:rPr>
+        <w:rFonts w:ascii="Symbol" w:hAnsi="Symbol" w:hint="default"/>
+      </w:rPr>
+    </w:lvl>
+    <w:lvl w:ilvl="4" w:tplc="04090003" w:tentative="1">
+      <w:start w:val="1"/>
+      <w:numFmt w:val="bullet"/>
+      <w:lvlText w:val="o"/>
+      <w:lvlJc w:val="left"/>
+      <w:pPr>
+        <w:ind w:left="3600" w:hanging="360"/>
+      </w:pPr>
+      <w:rPr>
+        <w:rFonts w:ascii="Courier New" w:hAnsi="Courier New" w:cs="Courier New" w:hint="default"/>
+      </w:rPr>
+    </w:lvl>
+    <w:lvl w:ilvl="5" w:tplc="04090005" w:tentative="1">
+      <w:start w:val="1"/>
+      <w:numFmt w:val="bullet"/>
+      <w:lvlText w:val=""/>
+      <w:lvlJc w:val="left"/>
+      <w:pPr>
+        <w:ind w:left="4320" w:hanging="360"/>
+      </w:pPr>
+      <w:rPr>
+        <w:rFonts w:ascii="Wingdings" w:hAnsi="Wingdings" w:hint="default"/>
+      </w:rPr>
+    </w:lvl>
+    <w:lvl w:ilvl="6" w:tplc="04090001" w:tentative="1">
+      <w:start w:val="1"/>
+      <w:numFmt w:val="bullet"/>
+      <w:lvlText w:val=""/>
+      <w:lvlJc w:val="left"/>
+      <w:pPr>
+        <w:ind w:left="5040" w:hanging="360"/>
+      </w:pPr>
+      <w:rPr>
+        <w:rFonts w:ascii="Symbol" w:hAnsi="Symbol" w:hint="default"/>
+      </w:rPr>
+    </w:lvl>
+    <w:lvl w:ilvl="7" w:tplc="04090003" w:tentative="1">
+      <w:start w:val="1"/>
+      <w:numFmt w:val="bullet"/>
+      <w:lvlText w:val="o"/>
+      <w:lvlJc w:val="left"/>
+      <w:pPr>
+        <w:ind w:left="5760" w:hanging="360"/>
+      </w:pPr>
+      <w:rPr>
+        <w:rFonts w:ascii="Courier New" w:hAnsi="Courier New" w:cs="Courier New" w:hint="default"/>
+      </w:rPr>
+    </w:lvl>
+    <w:lvl w:ilvl="8" w:tplc="04090005" w:tentative="1">
+      <w:start w:val="1"/>
+      <w:numFmt w:val="bullet"/>
+      <w:lvlText w:val=""/>
+      <w:lvlJc w:val="left"/>
+      <w:pPr>
+        <w:ind w:left="6480" w:hanging="360"/>
+      </w:pPr>
+      <w:rPr>
+        <w:rFonts w:ascii="Wingdings" w:hAnsi="Wingdings" w:hint="default"/>
+      </w:rPr>
+    </w:lvl>
+  </w:abstractNum>
+  <w:abstractNum w:abstractNumId="1" w15:restartNumberingAfterBreak="0">
     <w:nsid w:val="677A0152"/>
     <w:multiLevelType w:val="hybridMultilevel"/>
     <w:tmpl w:val="F6CCB696"/>
@@ -534,6 +917,9 @@
     </w:lvl>
   </w:abstractNum>
   <w:num w:numId="1" w16cid:durableId="1921602148">
+    <w:abstractNumId w:val="1"/>
+  </w:num>
+  <w:num w:numId="2" w16cid:durableId="1471970988">
     <w:abstractNumId w:val="0"/>
   </w:num>
 </w:numbering>

</xml_diff>

<commit_message>
Updated results from analyzing with LLMs
</commit_message>
<xml_diff>
--- a/6-13 Summer Project.docx
+++ b/6-13 Summer Project.docx
@@ -400,114 +400,229 @@
       </w:pPr>
     </w:p>
     <w:p>
-      <w:r>
-        <w:t>Julius:</w:t>
-      </w:r>
-    </w:p>
-    <w:p>
-      <w:pPr>
-        <w:pStyle w:val="ListParagraph"/>
-        <w:numPr>
-          <w:ilvl w:val="0"/>
-          <w:numId w:val="2"/>
-        </w:numPr>
-      </w:pPr>
-      <w:r>
-        <w:t>Uses</w:t>
-      </w:r>
-      <w:r>
-        <w:t xml:space="preserve"> Shapiro-Wilk, which generalizes pretty well to larger number of data points</w:t>
-      </w:r>
-    </w:p>
-    <w:p>
-      <w:pPr>
-        <w:pStyle w:val="ListParagraph"/>
-        <w:numPr>
-          <w:ilvl w:val="0"/>
-          <w:numId w:val="2"/>
-        </w:numPr>
-      </w:pPr>
-      <w:r>
-        <w:t>Uses parametric tests rather than non-parametric tests; however, GDP does not follow a normal distribution as per our analysis. Tests seem to generalize pretty well but it would be interesting to see cases where a non-parametric test is needed and results might differ</w:t>
-      </w:r>
-    </w:p>
-    <w:p>
-      <w:pPr>
-        <w:pStyle w:val="ListParagraph"/>
-        <w:numPr>
-          <w:ilvl w:val="0"/>
-          <w:numId w:val="2"/>
-        </w:numPr>
-      </w:pPr>
-      <w:r>
-        <w:t>Follow-up questions are interesting and useful</w:t>
-      </w:r>
-      <w:r>
-        <w:t xml:space="preserve"> – used Tukey’s HSD as a follow-up to ANOVA, which I did not know about and have incorporated into my code</w:t>
-      </w:r>
-    </w:p>
-    <w:p>
-      <w:pPr>
-        <w:pStyle w:val="ListParagraph"/>
-        <w:numPr>
-          <w:ilvl w:val="0"/>
-          <w:numId w:val="2"/>
-        </w:numPr>
-      </w:pPr>
-      <w:r>
-        <w:t>Multivariable linear regression does not seem to produce accurate results – Julius prints out all variables but only 2 actually have statistically significant p-values and are significant predictors</w:t>
-      </w:r>
-    </w:p>
-    <w:p>
-      <w:pPr>
-        <w:pStyle w:val="ListParagraph"/>
-        <w:numPr>
-          <w:ilvl w:val="0"/>
-          <w:numId w:val="2"/>
-        </w:numPr>
-      </w:pPr>
-      <w:r>
-        <w:t xml:space="preserve">I would consider GDP calculations for the same country over two years as a paired sample (as the country remains the same) but Julius uses an unpaired t-test </w:t>
-      </w:r>
-    </w:p>
-    <w:p>
-      <w:r>
-        <w:t>ChatGPT:</w:t>
-      </w:r>
-    </w:p>
-    <w:p>
-      <w:pPr>
-        <w:pStyle w:val="ListParagraph"/>
-        <w:numPr>
-          <w:ilvl w:val="0"/>
-          <w:numId w:val="2"/>
-        </w:numPr>
-      </w:pPr>
-      <w:r>
-        <w:t>Uses Shapiro-Wilk, same result as Julius</w:t>
-      </w:r>
-    </w:p>
-    <w:p>
-      <w:pPr>
-        <w:pStyle w:val="ListParagraph"/>
-        <w:numPr>
-          <w:ilvl w:val="0"/>
-          <w:numId w:val="2"/>
-        </w:numPr>
-      </w:pPr>
-      <w:r>
+      <w:pPr>
+        <w:rPr>
+          <w:b/>
+          <w:bCs/>
+          <w:u w:val="single"/>
+        </w:rPr>
+      </w:pPr>
+      <w:r>
+        <w:rPr>
+          <w:b/>
+          <w:bCs/>
+          <w:u w:val="single"/>
+        </w:rPr>
+        <w:t>Data Analytics Tools Comparisons</w:t>
+      </w:r>
+    </w:p>
+    <w:p>
+      <w:pPr>
         <w:rPr>
           <w:i/>
           <w:iCs/>
         </w:rPr>
-        <w:t xml:space="preserve">Ran out of GPT 4 usage so waiting to run </w:t>
-      </w:r>
+      </w:pPr>
       <w:r>
         <w:rPr>
           <w:i/>
           <w:iCs/>
         </w:rPr>
-        <w:t>this at 6 PM</w:t>
+        <w:t>Question: in the data pre-processing, I merged the files together to create one large file, and I passed versions of this (gdp file, all data for 2015 file, all data for 2010 file) to the AI tools. Is this okay? Or should I be indexing into each file individually?</w:t>
+      </w:r>
+    </w:p>
+    <w:p>
+      <w:r>
+        <w:t>Julius:</w:t>
+      </w:r>
+    </w:p>
+    <w:p>
+      <w:pPr>
+        <w:pStyle w:val="ListParagraph"/>
+        <w:numPr>
+          <w:ilvl w:val="0"/>
+          <w:numId w:val="2"/>
+        </w:numPr>
+      </w:pPr>
+      <w:r>
+        <w:t>Uses</w:t>
+      </w:r>
+      <w:r>
+        <w:t xml:space="preserve"> Shapiro-Wilk, which generalizes pretty well to larger number of data points</w:t>
+      </w:r>
+    </w:p>
+    <w:p>
+      <w:pPr>
+        <w:pStyle w:val="ListParagraph"/>
+        <w:numPr>
+          <w:ilvl w:val="0"/>
+          <w:numId w:val="2"/>
+        </w:numPr>
+      </w:pPr>
+      <w:r>
+        <w:t xml:space="preserve">Uses parametric tests rather than non-parametric tests; however, GDP does not follow a normal distribution as per our analysis. Tests seem to generalize pretty well </w:t>
+      </w:r>
+      <w:r>
+        <w:t xml:space="preserve">as there are a large number of data points </w:t>
+      </w:r>
+      <w:r>
+        <w:t>but it would be interesting to see cases where a non-parametric test is needed and results might differ</w:t>
+      </w:r>
+    </w:p>
+    <w:p>
+      <w:pPr>
+        <w:pStyle w:val="ListParagraph"/>
+        <w:numPr>
+          <w:ilvl w:val="0"/>
+          <w:numId w:val="2"/>
+        </w:numPr>
+      </w:pPr>
+      <w:r>
+        <w:t>Follow-up questions are interesting and useful</w:t>
+      </w:r>
+      <w:r>
+        <w:t xml:space="preserve"> – used Tukey’s HSD as a follow-up to ANOVA</w:t>
+      </w:r>
+    </w:p>
+    <w:p>
+      <w:pPr>
+        <w:pStyle w:val="ListParagraph"/>
+        <w:numPr>
+          <w:ilvl w:val="0"/>
+          <w:numId w:val="2"/>
+        </w:numPr>
+      </w:pPr>
+      <w:r>
+        <w:t>Multivariable linear regression does not seem to produce accurate results – Julius prints out all variables but only 2 actually have statistically significant p-values and are significant predictors</w:t>
+      </w:r>
+    </w:p>
+    <w:p>
+      <w:pPr>
+        <w:pStyle w:val="ListParagraph"/>
+        <w:numPr>
+          <w:ilvl w:val="0"/>
+          <w:numId w:val="2"/>
+        </w:numPr>
+      </w:pPr>
+      <w:r>
+        <w:t xml:space="preserve">I would consider GDP calculations for the same country over two years as a paired sample (as the country remains the same) but Julius uses an unpaired t-test </w:t>
+      </w:r>
+    </w:p>
+    <w:p>
+      <w:r>
+        <w:t>ChatGPT:</w:t>
+      </w:r>
+    </w:p>
+    <w:p>
+      <w:hyperlink r:id="rId6" w:history="1">
+        <w:r>
+          <w:rPr>
+            <w:rStyle w:val="Hyperlink"/>
+          </w:rPr>
+          <w:t>https://chatgpt.com/share/88710212-a334-4fba-82cb-6810080d1b54</w:t>
+        </w:r>
+      </w:hyperlink>
+    </w:p>
+    <w:p>
+      <w:hyperlink r:id="rId7" w:history="1">
+        <w:r>
+          <w:rPr>
+            <w:rStyle w:val="Hyperlink"/>
+          </w:rPr>
+          <w:t>https://chatgpt.com/share/b46ee7d9-fb0d-45a1-8098-3e698a05e9a8</w:t>
+        </w:r>
+      </w:hyperlink>
+    </w:p>
+    <w:p/>
+    <w:p>
+      <w:pPr>
+        <w:pStyle w:val="ListParagraph"/>
+        <w:numPr>
+          <w:ilvl w:val="0"/>
+          <w:numId w:val="2"/>
+        </w:numPr>
+      </w:pPr>
+      <w:r>
+        <w:t>Uses Shapiro-Wilk, same result as Julius</w:t>
+      </w:r>
+    </w:p>
+    <w:p>
+      <w:pPr>
+        <w:pStyle w:val="ListParagraph"/>
+        <w:numPr>
+          <w:ilvl w:val="0"/>
+          <w:numId w:val="2"/>
+        </w:numPr>
+      </w:pPr>
+      <w:r>
+        <w:t>In multiple regression, it removes some variables that it believes might be clear indicators of GDP – some of these do not need to be removed in my opinion (migrant stock) and others should be removed (real GDP) but are not</w:t>
+      </w:r>
+    </w:p>
+    <w:p>
+      <w:pPr>
+        <w:pStyle w:val="ListParagraph"/>
+        <w:numPr>
+          <w:ilvl w:val="1"/>
+          <w:numId w:val="2"/>
+        </w:numPr>
+      </w:pPr>
+      <w:r>
+        <w:t>This may lead to the slight differences in results</w:t>
+      </w:r>
+    </w:p>
+    <w:p>
+      <w:pPr>
+        <w:pStyle w:val="ListParagraph"/>
+        <w:numPr>
+          <w:ilvl w:val="0"/>
+          <w:numId w:val="2"/>
+        </w:numPr>
+      </w:pPr>
+      <w:r>
+        <w:t>Initially r</w:t>
+      </w:r>
+      <w:r>
+        <w:t>uns independent t-test rather than paired on data from same country</w:t>
+      </w:r>
+      <w:r>
+        <w:t>, later does a  paired test</w:t>
+      </w:r>
+    </w:p>
+    <w:p>
+      <w:pPr>
+        <w:pStyle w:val="ListParagraph"/>
+        <w:numPr>
+          <w:ilvl w:val="0"/>
+          <w:numId w:val="2"/>
+        </w:numPr>
+      </w:pPr>
+      <w:r>
+        <w:t>Not sure how accurate normality analysis is on small datasets – the histogram does not appear normal to me, for example</w:t>
+      </w:r>
+    </w:p>
+    <w:p>
+      <w:pPr>
+        <w:pStyle w:val="ListParagraph"/>
+        <w:numPr>
+          <w:ilvl w:val="1"/>
+          <w:numId w:val="2"/>
+        </w:numPr>
+      </w:pPr>
+      <w:r>
+        <w:lastRenderedPageBreak/>
+        <w:t>Prompting for a normality test then causes GPT to use non-parametric tests upon discovering non-normal data</w:t>
+      </w:r>
+    </w:p>
+    <w:p>
+      <w:pPr>
+        <w:pStyle w:val="ListParagraph"/>
+        <w:numPr>
+          <w:ilvl w:val="0"/>
+          <w:numId w:val="2"/>
+        </w:numPr>
+      </w:pPr>
+      <w:r>
+        <w:t>Follow-up to Kruskal-Wallis tests does not produce the correct result</w:t>
       </w:r>
     </w:p>
     <w:p>
@@ -516,11 +631,118 @@
       </w:r>
     </w:p>
     <w:p>
+      <w:pPr>
+        <w:pStyle w:val="ListParagraph"/>
+        <w:numPr>
+          <w:ilvl w:val="0"/>
+          <w:numId w:val="2"/>
+        </w:numPr>
+      </w:pPr>
+      <w:r>
+        <w:t>Unable to run code to analyze my data within the platform – can only provide written summaries or code that I have to run myself</w:t>
+      </w:r>
+    </w:p>
+    <w:p>
+      <w:pPr>
+        <w:pStyle w:val="ListParagraph"/>
+        <w:numPr>
+          <w:ilvl w:val="1"/>
+          <w:numId w:val="2"/>
+        </w:numPr>
+      </w:pPr>
+      <w:r>
+        <w:t>Code correctly runs the tests</w:t>
+      </w:r>
+    </w:p>
+    <w:p>
+      <w:pPr>
+        <w:pStyle w:val="ListParagraph"/>
+        <w:numPr>
+          <w:ilvl w:val="0"/>
+          <w:numId w:val="2"/>
+        </w:numPr>
+      </w:pPr>
+      <w:r>
+        <w:t>Uses Shapiro-Wilk, though mentions that the test might not be too useful for large datasets</w:t>
+      </w:r>
+    </w:p>
+    <w:p>
+      <w:pPr>
+        <w:pStyle w:val="ListParagraph"/>
+        <w:numPr>
+          <w:ilvl w:val="0"/>
+          <w:numId w:val="2"/>
+        </w:numPr>
+      </w:pPr>
+      <w:r>
+        <w:t>Once I prompted it to let it know that some variables might be non-parametric, began providing both parametric and nonparametric alternatives</w:t>
+      </w:r>
+    </w:p>
+    <w:p>
+      <w:pPr>
+        <w:pStyle w:val="ListParagraph"/>
+        <w:numPr>
+          <w:ilvl w:val="0"/>
+          <w:numId w:val="2"/>
+        </w:numPr>
+      </w:pPr>
+      <w:r>
+        <w:t>Correctly uses paired t-test to analyze data from one country over two years</w:t>
+      </w:r>
+    </w:p>
+    <w:p>
+      <w:pPr>
+        <w:pStyle w:val="ListParagraph"/>
+        <w:numPr>
+          <w:ilvl w:val="0"/>
+          <w:numId w:val="2"/>
+        </w:numPr>
+      </w:pPr>
+      <w:r>
+        <w:t>Suggestions were helpful though not as much as Julius</w:t>
+      </w:r>
+    </w:p>
+    <w:p>
+      <w:pPr>
+        <w:pStyle w:val="ListParagraph"/>
+        <w:numPr>
+          <w:ilvl w:val="0"/>
+          <w:numId w:val="2"/>
+        </w:numPr>
+      </w:pPr>
+      <w:r>
+        <w:t>Copilot w/in Excel unable to run statistical tests</w:t>
+      </w:r>
+    </w:p>
+    <w:p>
       <w:r>
         <w:t>Databricks:</w:t>
       </w:r>
     </w:p>
-    <w:p/>
+    <w:p>
+      <w:pPr>
+        <w:pStyle w:val="ListParagraph"/>
+        <w:numPr>
+          <w:ilvl w:val="0"/>
+          <w:numId w:val="2"/>
+        </w:numPr>
+      </w:pPr>
+      <w:r>
+        <w:t>Community edition does not allow the AI Assistant… not sure why – did some troubleshooting but could not get it to work</w:t>
+      </w:r>
+    </w:p>
+    <w:p>
+      <w:pPr>
+        <w:pStyle w:val="ListParagraph"/>
+        <w:numPr>
+          <w:ilvl w:val="0"/>
+          <w:numId w:val="2"/>
+        </w:numPr>
+      </w:pPr>
+      <w:r>
+        <w:t>Asked my dad to give me access to the AI-powered version, he’s still working on it</w:t>
+      </w:r>
+    </w:p>
     <w:p>
       <w:r>
         <w:t>Tests to determine normality:</w:t>
@@ -613,8 +835,19 @@
         </w:numPr>
       </w:pPr>
       <w:r>
-        <w:lastRenderedPageBreak/>
-        <w:t xml:space="preserve">With larger data sets, CLT will allow us to generally assume a normal distribution </w:t>
+        <w:t>With larger data sets, CLT will allow us to generally assume a normal distribution</w:t>
+      </w:r>
+    </w:p>
+    <w:p>
+      <w:pPr>
+        <w:pStyle w:val="ListParagraph"/>
+        <w:numPr>
+          <w:ilvl w:val="2"/>
+          <w:numId w:val="2"/>
+        </w:numPr>
+      </w:pPr>
+      <w:r>
+        <w:t>So some say we can use t-tests with sample sizes greater than 40</w:t>
       </w:r>
     </w:p>
     <w:p>
@@ -622,6 +855,9 @@
         <w:t xml:space="preserve">Example – K-S says this is normal but S-W says it’s not. I would say it’s not normal based on the QQ plot    </w:t>
       </w:r>
       <w:r>
+        <w:rPr>
+          <w:noProof/>
+        </w:rPr>
         <w:drawing>
           <wp:inline distT="0" distB="0" distL="0" distR="0" wp14:anchorId="5A804FAF" wp14:editId="525527C2">
             <wp:extent cx="1863643" cy="1333742"/>
@@ -638,7 +874,7 @@
                     <pic:cNvPicPr/>
                   </pic:nvPicPr>
                   <pic:blipFill>
-                    <a:blip r:embed="rId6"/>
+                    <a:blip r:embed="rId8"/>
                     <a:stretch>
                       <a:fillRect/>
                     </a:stretch>
@@ -661,25 +897,182 @@
     </w:p>
     <w:p>
       <w:pPr>
-        <w:pStyle w:val="ListParagraph"/>
-        <w:numPr>
-          <w:ilvl w:val="0"/>
-          <w:numId w:val="2"/>
-        </w:numPr>
         <w:rPr>
           <w:i/>
           <w:iCs/>
         </w:rPr>
       </w:pPr>
-      <w:r>
+    </w:p>
+    <w:p>
+      <w:pPr>
         <w:rPr>
           <w:i/>
           <w:iCs/>
         </w:rPr>
-        <w:t>To do: go through the data and plot discrepancies between the two, determine whether one might be better than the other since the literature is unclear</w:t>
-      </w:r>
-    </w:p>
-    <w:p/>
+      </w:pPr>
+    </w:p>
+    <w:p>
+      <w:pPr>
+        <w:rPr>
+          <w:i/>
+          <w:iCs/>
+          <w:u w:val="single"/>
+        </w:rPr>
+      </w:pPr>
+      <w:r>
+        <w:rPr>
+          <w:i/>
+          <w:iCs/>
+          <w:u w:val="single"/>
+        </w:rPr>
+        <w:t>To do</w:t>
+      </w:r>
+      <w:r>
+        <w:rPr>
+          <w:i/>
+          <w:iCs/>
+          <w:u w:val="single"/>
+        </w:rPr>
+        <w:t>/Questions</w:t>
+      </w:r>
+      <w:r>
+        <w:rPr>
+          <w:i/>
+          <w:iCs/>
+          <w:u w:val="single"/>
+        </w:rPr>
+        <w:t>:</w:t>
+      </w:r>
+    </w:p>
+    <w:p>
+      <w:pPr>
+        <w:pStyle w:val="ListParagraph"/>
+        <w:numPr>
+          <w:ilvl w:val="0"/>
+          <w:numId w:val="2"/>
+        </w:numPr>
+        <w:rPr>
+          <w:i/>
+          <w:iCs/>
+        </w:rPr>
+      </w:pPr>
+      <w:r>
+        <w:rPr>
+          <w:i/>
+          <w:iCs/>
+        </w:rPr>
+        <w:t xml:space="preserve"> </w:t>
+      </w:r>
+      <w:r>
+        <w:rPr>
+          <w:i/>
+          <w:iCs/>
+        </w:rPr>
+        <w:t>G</w:t>
+      </w:r>
+      <w:r>
+        <w:rPr>
+          <w:i/>
+          <w:iCs/>
+        </w:rPr>
+        <w:t xml:space="preserve">o through the data and plot discrepancies between </w:t>
+      </w:r>
+      <w:r>
+        <w:rPr>
+          <w:i/>
+          <w:iCs/>
+        </w:rPr>
+        <w:t>tests of normality (K-S and S-W)</w:t>
+      </w:r>
+      <w:r>
+        <w:rPr>
+          <w:i/>
+          <w:iCs/>
+        </w:rPr>
+        <w:t xml:space="preserve"> in the GDP dataset</w:t>
+      </w:r>
+      <w:r>
+        <w:rPr>
+          <w:i/>
+          <w:iCs/>
+        </w:rPr>
+        <w:t>, determine whether one might be better than the other since the literature is unclear</w:t>
+      </w:r>
+    </w:p>
+    <w:p>
+      <w:pPr>
+        <w:pStyle w:val="ListParagraph"/>
+        <w:numPr>
+          <w:ilvl w:val="0"/>
+          <w:numId w:val="2"/>
+        </w:numPr>
+        <w:rPr>
+          <w:i/>
+          <w:iCs/>
+        </w:rPr>
+      </w:pPr>
+      <w:r>
+        <w:rPr>
+          <w:i/>
+          <w:iCs/>
+        </w:rPr>
+        <w:t>Potentially modify code to allow for reading from different files rather than one merged file</w:t>
+      </w:r>
+      <w:r>
+        <w:rPr>
+          <w:i/>
+          <w:iCs/>
+        </w:rPr>
+        <w:t>, re-run LLMs to see how this changes analysis</w:t>
+      </w:r>
+    </w:p>
+    <w:p>
+      <w:pPr>
+        <w:pStyle w:val="ListParagraph"/>
+        <w:numPr>
+          <w:ilvl w:val="1"/>
+          <w:numId w:val="2"/>
+        </w:numPr>
+        <w:rPr>
+          <w:i/>
+          <w:iCs/>
+        </w:rPr>
+      </w:pPr>
+      <w:r>
+        <w:rPr>
+          <w:i/>
+          <w:iCs/>
+        </w:rPr>
+        <w:t>How much should I prompt LLMs, if at all?</w:t>
+      </w:r>
+    </w:p>
+    <w:p>
+      <w:pPr>
+        <w:pStyle w:val="ListParagraph"/>
+        <w:numPr>
+          <w:ilvl w:val="0"/>
+          <w:numId w:val="2"/>
+        </w:numPr>
+        <w:rPr>
+          <w:i/>
+          <w:iCs/>
+        </w:rPr>
+      </w:pPr>
+      <w:r>
+        <w:rPr>
+          <w:i/>
+          <w:iCs/>
+        </w:rPr>
+        <w:t xml:space="preserve">Begin </w:t>
+      </w:r>
+      <w:r>
+        <w:rPr>
+          <w:i/>
+          <w:iCs/>
+        </w:rPr>
+        <w:t>writing code for broader questions, clustering analysis</w:t>
+      </w:r>
+    </w:p>
     <w:sectPr>
       <w:pgSz w:w="12240" w:h="15840"/>
       <w:pgMar w:top="1440" w:right="1440" w:bottom="1440" w:left="1440" w:header="720" w:footer="720" w:gutter="0"/>
@@ -719,7 +1112,7 @@
         <w:rFonts w:ascii="Courier New" w:hAnsi="Courier New" w:cs="Courier New" w:hint="default"/>
       </w:rPr>
     </w:lvl>
-    <w:lvl w:ilvl="2" w:tplc="04090005" w:tentative="1">
+    <w:lvl w:ilvl="2" w:tplc="04090005">
       <w:start w:val="1"/>
       <w:numFmt w:val="bullet"/>
       <w:lvlText w:val=""/>

</xml_diff>

<commit_message>
Updated code, ran descriptive statistics analyses
</commit_message>
<xml_diff>
--- a/6-13 Summer Project.docx
+++ b/6-13 Summer Project.docx
@@ -304,9 +304,40 @@
         <w:t>?</w:t>
       </w:r>
     </w:p>
+    <w:p>
+      <w:pPr>
+        <w:rPr>
+          <w:b/>
+          <w:bCs/>
+        </w:rPr>
+      </w:pPr>
+      <w:r>
+        <w:rPr>
+          <w:b/>
+          <w:bCs/>
+        </w:rPr>
+        <w:t>- Which variables might be confounding variables?</w:t>
+      </w:r>
+    </w:p>
+    <w:p>
+      <w:pPr>
+        <w:rPr>
+          <w:b/>
+          <w:bCs/>
+        </w:rPr>
+      </w:pPr>
+      <w:r>
+        <w:rPr>
+          <w:b/>
+          <w:bCs/>
+        </w:rPr>
+        <w:t>- Which variables might interact with one another?</w:t>
+      </w:r>
+    </w:p>
     <w:p/>
     <w:p>
       <w:r>
+        <w:lastRenderedPageBreak/>
         <w:t>Broader Questions:</w:t>
       </w:r>
     </w:p>
@@ -337,7 +368,6 @@
           <w:b/>
           <w:bCs/>
         </w:rPr>
-        <w:lastRenderedPageBreak/>
         <w:t>- Suppose we were to cluster these countries. What variables would define each cluster</w:t>
       </w:r>
       <w:r>
@@ -683,6 +713,7 @@
           <w:i/>
           <w:iCs/>
         </w:rPr>
+        <w:lastRenderedPageBreak/>
         <w:t xml:space="preserve"> </w:t>
       </w:r>
       <w:r>
@@ -738,7 +769,6 @@
           <w:i/>
           <w:iCs/>
         </w:rPr>
-        <w:lastRenderedPageBreak/>
         <w:t>M</w:t>
       </w:r>
       <w:r>
@@ -892,6 +922,7 @@
           <w:iCs/>
         </w:rPr>
       </w:pPr>
+      <w:bookmarkStart w:id="1" w:name="_Hlk170075656"/>
       <w:r>
         <w:rPr>
           <w:i/>
@@ -939,6 +970,7 @@
         </w:rPr>
         <w:t>Most frequent, missing values, analyze count distribution</w:t>
       </w:r>
+      <w:bookmarkEnd w:id="1"/>
     </w:p>
     <w:sectPr>
       <w:pgSz w:w="12240" w:h="15840"/>

</xml_diff>